<commit_message>
Focus Telegram inline buy flow and success state
</commit_message>
<xml_diff>
--- a/output/doc/charm-alpha-vaults-v2-4626fun-master-qa.docx
+++ b/output/doc/charm-alpha-vaults-v2-4626fun-master-qa.docx
@@ -122,15 +122,6 @@
       </w:pPr>
       <w:r>
         <w:rPr>
-          <w:b/>
-        </w:rPr>
-        <w:t>Answer:</w:t>
-      </w:r>
-      <w:r>
-        <w:t xml:space="preserve"> </w:t>
-      </w:r>
-      <w:r>
-        <w:rPr>
           <w:rFonts w:ascii="Courier New" w:hAnsi="Courier New"/>
           <w:sz w:val="19"/>
         </w:rPr>
@@ -193,13 +184,7 @@
         <w:pStyle w:val="BodyText"/>
       </w:pPr>
       <w:r>
-        <w:rPr>
-          <w:b/>
-        </w:rPr>
-        <w:t>Answer:</w:t>
-      </w:r>
-      <w:r>
-        <w:t xml:space="preserve"> Vault contracts store policy and accounting state (shares, thresholds, fee settings, last rebalance metadata), while active liquidity composition, fee growth, and executable market conditions are inferred from Uniswap v3 pool state.</w:t>
+        <w:t>Vault contracts store policy and accounting state (shares, thresholds, fee settings, last rebalance metadata), while active liquidity composition, fee growth, and executable market conditions are inferred from Uniswap v3 pool state.</w:t>
       </w:r>
     </w:p>
     <w:p>
@@ -215,13 +200,7 @@
         <w:pStyle w:val="BodyText"/>
       </w:pPr>
       <w:r>
-        <w:rPr>
-          <w:b/>
-        </w:rPr>
-        <w:t>Answer:</w:t>
-      </w:r>
-      <w:r>
-        <w:t xml:space="preserve"> Onchain enforces state transitions and permission checks; managerial/offchain decides rebalance timing, parameter updates, and operational runbooks. In 4626fun, additional offchain decisions exist in queue/keeper/CSW execution paths.</w:t>
+        <w:t>Onchain enforces state transitions and permission checks; managerial/offchain decides rebalance timing, parameter updates, and operational runbooks. In 4626fun, additional offchain decisions exist in queue/keeper/CSW execution paths.</w:t>
       </w:r>
     </w:p>
     <w:p>
@@ -237,13 +216,7 @@
         <w:pStyle w:val="BodyText"/>
       </w:pPr>
       <w:r>
-        <w:rPr>
-          <w:b/>
-        </w:rPr>
-        <w:t>Answer:</w:t>
-      </w:r>
-      <w:r>
-        <w:t xml:space="preserve"> It is semi-managed but economically manager-dependent. Contracts are deterministic, but outcomes depend heavily on rebalance policy quality and operator liveness.</w:t>
+        <w:t>It is semi-managed but economically manager-dependent. Contracts are deterministic, but outcomes depend heavily on rebalance policy quality and operator liveness.</w:t>
       </w:r>
     </w:p>
     <w:p>
@@ -259,13 +232,7 @@
         <w:pStyle w:val="BodyText"/>
       </w:pPr>
       <w:r>
-        <w:rPr>
-          <w:b/>
-        </w:rPr>
-        <w:t>Answer:</w:t>
-      </w:r>
-      <w:r>
-        <w:t xml:space="preserve"> The design assumes mean-reverting fee capture, manageable inventory drift, and timely rebalances. The one-sided residual leg assumes leftover directional inventory can be placed without becoming a systematic adverse-selection sink.</w:t>
+        <w:t>The design assumes mean-reverting fee capture, manageable inventory drift, and timely rebalances. The one-sided residual leg assumes leftover directional inventory can be placed without becoming a systematic adverse-selection sink.</w:t>
       </w:r>
     </w:p>
     <w:p>
@@ -289,13 +256,7 @@
         <w:pStyle w:val="BodyText"/>
       </w:pPr>
       <w:r>
-        <w:rPr>
-          <w:b/>
-        </w:rPr>
-        <w:t>Answer:</w:t>
-      </w:r>
-      <w:r>
-        <w:t xml:space="preserve"> Shares are minted/burned pro-rata against vault accounting state using Charm share math in native vaults, and ERC-4626 conversion logic in </w:t>
+        <w:t xml:space="preserve">Shares are minted/burned pro-rata against vault accounting state using Charm share math in native vaults, and ERC-4626 conversion logic in </w:t>
       </w:r>
       <w:r>
         <w:rPr>
@@ -321,13 +282,7 @@
         <w:pStyle w:val="BodyText"/>
       </w:pPr>
       <w:r>
-        <w:rPr>
-          <w:b/>
-        </w:rPr>
-        <w:t>Answer:</w:t>
-      </w:r>
-      <w:r>
-        <w:t xml:space="preserve"> A share is a proportional claim on idle balances plus CLMM position inventory plus claimable fees, net of protocol/manager fee policy and subject to execution-path constraints.</w:t>
+        <w:t>A share is a proportional claim on idle balances plus CLMM position inventory plus claimable fees, net of protocol/manager fee policy and subject to execution-path constraints.</w:t>
       </w:r>
     </w:p>
     <w:p>
@@ -343,13 +298,7 @@
         <w:pStyle w:val="BodyText"/>
       </w:pPr>
       <w:r>
-        <w:rPr>
-          <w:b/>
-        </w:rPr>
-        <w:t>Answer:</w:t>
-      </w:r>
-      <w:r>
-        <w:t xml:space="preserve"> They can sit idle. Native and wrapped flows can hold inventory until rebalance/deployment conditions are met.</w:t>
+        <w:t>They can sit idle. Native and wrapped flows can hold inventory until rebalance/deployment conditions are met.</w:t>
       </w:r>
     </w:p>
     <w:p>
@@ -365,13 +314,7 @@
         <w:pStyle w:val="BodyText"/>
       </w:pPr>
       <w:r>
-        <w:rPr>
-          <w:b/>
-        </w:rPr>
-        <w:t>Answer:</w:t>
-      </w:r>
-      <w:r>
-        <w:t xml:space="preserve"> It is reasonably fair under normal cadence, but timing windows still exist around poke/rebalance and stale fee realization. Fairness is path-dependent, not absolute.</w:t>
+        <w:t>It is reasonably fair under normal cadence, but timing windows still exist around poke/rebalance and stale fee realization. Fairness is path-dependent, not absolute.</w:t>
       </w:r>
     </w:p>
     <w:p>
@@ -397,13 +340,7 @@
         <w:pStyle w:val="BodyText"/>
       </w:pPr>
       <w:r>
-        <w:rPr>
-          <w:b/>
-        </w:rPr>
-        <w:t>Answer:</w:t>
-      </w:r>
-      <w:r>
-        <w:t xml:space="preserve"> It is an accounting estimate, not a guaranteed synchronous withdrawal value.</w:t>
+        <w:t>It is an accounting estimate, not a guaranteed synchronous withdrawal value.</w:t>
       </w:r>
     </w:p>
     <w:p>
@@ -430,15 +367,6 @@
       </w:pPr>
       <w:r>
         <w:rPr>
-          <w:b/>
-        </w:rPr>
-        <w:t>Answer:</w:t>
-      </w:r>
-      <w:r>
-        <w:t xml:space="preserve"> </w:t>
-      </w:r>
-      <w:r>
-        <w:rPr>
           <w:rFonts w:ascii="Courier New" w:hAnsi="Courier New"/>
           <w:sz w:val="19"/>
         </w:rPr>
@@ -461,13 +389,7 @@
         <w:pStyle w:val="BodyText"/>
       </w:pPr>
       <w:r>
-        <w:rPr>
-          <w:b/>
-        </w:rPr>
-        <w:t>Answer:</w:t>
-      </w:r>
-      <w:r>
-        <w:t xml:space="preserve"> Yes. Unpoked fee windows can shift value between cohorts and create temporary accounting drift.</w:t>
+        <w:t>Yes. Unpoked fee windows can shift value between cohorts and create temporary accounting drift.</w:t>
       </w:r>
     </w:p>
     <w:p>
@@ -483,13 +405,7 @@
         <w:pStyle w:val="BodyText"/>
       </w:pPr>
       <w:r>
-        <w:rPr>
-          <w:b/>
-        </w:rPr>
-        <w:t>Answer:</w:t>
-      </w:r>
-      <w:r>
-        <w:t xml:space="preserve"> Yes. Small timing-sensitive interactions can influence when fee state is realized and who benefits.</w:t>
+        <w:t>Yes. Small timing-sensitive interactions can influence when fee state is realized and who benefits.</w:t>
       </w:r>
     </w:p>
     <w:p>
@@ -505,13 +421,7 @@
         <w:pStyle w:val="BodyText"/>
       </w:pPr>
       <w:r>
-        <w:rPr>
-          <w:b/>
-        </w:rPr>
-        <w:t>Answer:</w:t>
-      </w:r>
-      <w:r>
-        <w:t xml:space="preserve"> Potentially yes, especially around stale accounting windows, rebalance boundaries, and stress exits.</w:t>
+        <w:t>Potentially yes, especially around stale accounting windows, rebalance boundaries, and stress exits.</w:t>
       </w:r>
     </w:p>
     <w:p>
@@ -527,13 +437,7 @@
         <w:pStyle w:val="BodyText"/>
       </w:pPr>
       <w:r>
-        <w:rPr>
-          <w:b/>
-        </w:rPr>
-        <w:t>Answer:</w:t>
-      </w:r>
-      <w:r>
-        <w:t xml:space="preserve"> Yes. Native Charm has first-liquidity mechanics; 4626fun adds </w:t>
+        <w:t xml:space="preserve">Yes. Native Charm has first-liquidity mechanics; 4626fun adds </w:t>
       </w:r>
       <w:r>
         <w:rPr>
@@ -569,13 +473,7 @@
         <w:pStyle w:val="BodyText"/>
       </w:pPr>
       <w:r>
-        <w:rPr>
-          <w:b/>
-        </w:rPr>
-        <w:t>Answer:</w:t>
-      </w:r>
-      <w:r>
-        <w:t xml:space="preserve"> Yes. ERC-4626 previews can look synchronous while underlying exits remain path-dependent and sometimes queue-dependent.</w:t>
+        <w:t>Yes. ERC-4626 previews can look synchronous while underlying exits remain path-dependent and sometimes queue-dependent.</w:t>
       </w:r>
     </w:p>
     <w:p>
@@ -599,13 +497,7 @@
         <w:pStyle w:val="BodyText"/>
       </w:pPr>
       <w:r>
-        <w:rPr>
-          <w:b/>
-        </w:rPr>
-        <w:t>Answer:</w:t>
-      </w:r>
-      <w:r>
-        <w:t xml:space="preserve"> Rebalance logic allocates into full/base ranges and then deploys residual inventory one-sided, making residual placement highly sensitive to direction and timing.</w:t>
+        <w:t>Rebalance logic allocates into full/base ranges and then deploys residual inventory one-sided, making residual placement highly sensitive to direction and timing.</w:t>
       </w:r>
     </w:p>
     <w:p>
@@ -621,13 +513,7 @@
         <w:pStyle w:val="BodyText"/>
       </w:pPr>
       <w:r>
-        <w:rPr>
-          <w:b/>
-        </w:rPr>
-        <w:t>Answer:</w:t>
-      </w:r>
-      <w:r>
-        <w:t xml:space="preserve"> Mean-reverting, fee-rich, moderate-volatility regimes with disciplined rebalance cadence.</w:t>
+        <w:t>Mean-reverting, fee-rich, moderate-volatility regimes with disciplined rebalance cadence.</w:t>
       </w:r>
     </w:p>
     <w:p>
@@ -643,13 +529,7 @@
         <w:pStyle w:val="BodyText"/>
       </w:pPr>
       <w:r>
-        <w:rPr>
-          <w:b/>
-        </w:rPr>
-        <w:t>Answer:</w:t>
-      </w:r>
-      <w:r>
-        <w:t xml:space="preserve"> Persistent trends, sharp gaps, thin-liquidity markets, and volatility spikes with informed flow.</w:t>
+        <w:t>Persistent trends, sharp gaps, thin-liquidity markets, and volatility spikes with informed flow.</w:t>
       </w:r>
     </w:p>
     <w:p>
@@ -665,13 +545,7 @@
         <w:pStyle w:val="BodyText"/>
       </w:pPr>
       <w:r>
-        <w:rPr>
-          <w:b/>
-        </w:rPr>
-        <w:t>Answer:</w:t>
-      </w:r>
-      <w:r>
-        <w:t xml:space="preserve"> Trending and gap regimes increase inventory damage; chop improves fee capture; spikes increase both fee opportunity and extraction risk; prolonged one-sided flow amplifies residual-order directional exposure.</w:t>
+        <w:t>Trending and gap regimes increase inventory damage; chop improves fee capture; spikes increase both fee opportunity and extraction risk; prolonged one-sided flow amplifies residual-order directional exposure.</w:t>
       </w:r>
     </w:p>
     <w:p>
@@ -687,13 +561,7 @@
         <w:pStyle w:val="BodyText"/>
       </w:pPr>
       <w:r>
-        <w:rPr>
-          <w:b/>
-        </w:rPr>
-        <w:t>Answer:</w:t>
-      </w:r>
-      <w:r>
-        <w:t xml:space="preserve"> Yes. It can magnify directional inventory risk and informed-flow extraction.</w:t>
+        <w:t>Yes. It can magnify directional inventory risk and informed-flow extraction.</w:t>
       </w:r>
     </w:p>
     <w:p>
@@ -709,13 +577,7 @@
         <w:pStyle w:val="BodyText"/>
       </w:pPr>
       <w:r>
-        <w:rPr>
-          <w:b/>
-        </w:rPr>
-        <w:t>Answer:</w:t>
-      </w:r>
-      <w:r>
-        <w:t xml:space="preserve"> Materially exposed to all of these under weak guards or predictable rebalance timing.</w:t>
+        <w:t>Materially exposed to all of these under weak guards or predictable rebalance timing.</w:t>
       </w:r>
     </w:p>
     <w:p>
@@ -731,13 +593,7 @@
         <w:pStyle w:val="BodyText"/>
       </w:pPr>
       <w:r>
-        <w:rPr>
-          <w:b/>
-        </w:rPr>
-        <w:t>Answer:</w:t>
-      </w:r>
-      <w:r>
-        <w:t xml:space="preserve"> Yes. Gross fee prints can mask net PnL deterioration from directional inventory drift.</w:t>
+        <w:t>Yes. Gross fee prints can mask net PnL deterioration from directional inventory drift.</w:t>
       </w:r>
     </w:p>
     <w:p>
@@ -753,13 +609,7 @@
         <w:pStyle w:val="BodyText"/>
       </w:pPr>
       <w:r>
-        <w:rPr>
-          <w:b/>
-        </w:rPr>
-        <w:t>Answer:</w:t>
-      </w:r>
-      <w:r>
-        <w:t xml:space="preserve"> It is a hedge-return tradeoff; in current 4626 deployment defaults (</w:t>
+        <w:t>It is a hedge-return tradeoff; in current 4626 deployment defaults (</w:t>
       </w:r>
       <w:r>
         <w:rPr>
@@ -785,13 +635,7 @@
         <w:pStyle w:val="BodyText"/>
       </w:pPr>
       <w:r>
-        <w:rPr>
-          <w:b/>
-        </w:rPr>
-        <w:t>Answer:</w:t>
-      </w:r>
-      <w:r>
-        <w:t xml:space="preserve"> Yes. Current deployment parameter choices are liveness-sensitive and can permit either over-churn or delayed adaptation.</w:t>
+        <w:t>Yes. Current deployment parameter choices are liveness-sensitive and can permit either over-churn or delayed adaptation.</w:t>
       </w:r>
     </w:p>
     <w:p>
@@ -825,13 +669,7 @@
         <w:pStyle w:val="BodyText"/>
       </w:pPr>
       <w:r>
-        <w:rPr>
-          <w:b/>
-        </w:rPr>
-        <w:t>Answer:</w:t>
-      </w:r>
-      <w:r>
-        <w:t xml:space="preserve"> At high level: burn existing liquidity, collect/snapshot, compute new bands from current tick and thresholds, mint full/base/residual positions, then update rebalance metadata and fee activation state.</w:t>
+        <w:t>At high level: burn existing liquidity, collect/snapshot, compute new bands from current tick and thresholds, mint full/base/residual positions, then update rebalance metadata and fee activation state.</w:t>
       </w:r>
     </w:p>
     <w:p>
@@ -847,13 +685,7 @@
         <w:pStyle w:val="BodyText"/>
       </w:pPr>
       <w:r>
-        <w:rPr>
-          <w:b/>
-        </w:rPr>
-        <w:t>Answer:</w:t>
-      </w:r>
-      <w:r>
-        <w:t xml:space="preserve"> Partially. They are conditionally strict and have a risk window before explicit delegate assignment.</w:t>
+        <w:t>Partially. They are conditionally strict and have a risk window before explicit delegate assignment.</w:t>
       </w:r>
     </w:p>
     <w:p>
@@ -879,13 +711,7 @@
         <w:pStyle w:val="BodyText"/>
       </w:pPr>
       <w:r>
-        <w:rPr>
-          <w:b/>
-        </w:rPr>
-        <w:t>Answer:</w:t>
-      </w:r>
-      <w:r>
-        <w:t xml:space="preserve"> Rebalance can be externally callable, creating an adversarial timing surface.</w:t>
+        <w:t>Rebalance can be externally callable, creating an adversarial timing surface.</w:t>
       </w:r>
     </w:p>
     <w:p>
@@ -901,13 +727,7 @@
         <w:pStyle w:val="BodyText"/>
       </w:pPr>
       <w:r>
-        <w:rPr>
-          <w:b/>
-        </w:rPr>
-        <w:t>Answer:</w:t>
-      </w:r>
-      <w:r>
-        <w:t xml:space="preserve"> Situationally acceptable in a deliberate permissionless model, but dangerous in production without stronger guard envelopes and operational controls.</w:t>
+        <w:t>Situationally acceptable in a deliberate permissionless model, but dangerous in production without stronger guard envelopes and operational controls.</w:t>
       </w:r>
     </w:p>
     <w:p>
@@ -953,13 +773,7 @@
         <w:pStyle w:val="BodyText"/>
       </w:pPr>
       <w:r>
-        <w:rPr>
-          <w:b/>
-        </w:rPr>
-        <w:t>Answer:</w:t>
-      </w:r>
-      <w:r>
-        <w:t xml:space="preserve"> They are explicit but parameter-dependent; poor calibration can either block needed action or allow economically bad action.</w:t>
+        <w:t>They are explicit but parameter-dependent; poor calibration can either block needed action or allow economically bad action.</w:t>
       </w:r>
     </w:p>
     <w:p>
@@ -975,13 +789,7 @@
         <w:pStyle w:val="BodyText"/>
       </w:pPr>
       <w:r>
-        <w:rPr>
-          <w:b/>
-        </w:rPr>
-        <w:t>Answer:</w:t>
-      </w:r>
-      <w:r>
-        <w:t xml:space="preserve"> Near thresholds in low-depth conditions, yes.</w:t>
+        <w:t>Near thresholds in low-depth conditions, yes.</w:t>
       </w:r>
     </w:p>
     <w:p>
@@ -997,13 +805,7 @@
         <w:pStyle w:val="BodyText"/>
       </w:pPr>
       <w:r>
-        <w:rPr>
-          <w:b/>
-        </w:rPr>
-        <w:t>Answer:</w:t>
-      </w:r>
-      <w:r>
-        <w:t xml:space="preserve"> Yes. Rule compliance does not imply economic optimality.</w:t>
+        <w:t>Yes. Rule compliance does not imply economic optimality.</w:t>
       </w:r>
     </w:p>
     <w:p>
@@ -1019,13 +821,7 @@
         <w:pStyle w:val="BodyText"/>
       </w:pPr>
       <w:r>
-        <w:rPr>
-          <w:b/>
-        </w:rPr>
-        <w:t>Answer:</w:t>
-      </w:r>
-      <w:r>
-        <w:t xml:space="preserve"> Yes, eligibility patterns can become predictable.</w:t>
+        <w:t>Yes, eligibility patterns can become predictable.</w:t>
       </w:r>
     </w:p>
     <w:p>
@@ -1041,13 +837,7 @@
         <w:pStyle w:val="BodyText"/>
       </w:pPr>
       <w:r>
-        <w:rPr>
-          <w:b/>
-        </w:rPr>
-        <w:t>Answer:</w:t>
-      </w:r>
-      <w:r>
-        <w:t xml:space="preserve"> Yes. This is a core MEV surface.</w:t>
+        <w:t>Yes. This is a core MEV surface.</w:t>
       </w:r>
     </w:p>
     <w:p>
@@ -1063,13 +853,7 @@
         <w:pStyle w:val="BodyText"/>
       </w:pPr>
       <w:r>
-        <w:rPr>
-          <w:b/>
-        </w:rPr>
-        <w:t>Answer:</w:t>
-      </w:r>
-      <w:r>
-        <w:t xml:space="preserve"> Helpful but insufficient as a standalone anti-MEV defense.</w:t>
+        <w:t>Helpful but insufficient as a standalone anti-MEV defense.</w:t>
       </w:r>
     </w:p>
     <w:p>
@@ -1085,13 +869,7 @@
         <w:pStyle w:val="BodyText"/>
       </w:pPr>
       <w:r>
-        <w:rPr>
-          <w:b/>
-        </w:rPr>
-        <w:t>Answer:</w:t>
-      </w:r>
-      <w:r>
-        <w:t xml:space="preserve"> Yes. Safety checks can be technically satisfied while economically misleading.</w:t>
+        <w:t>Yes. Safety checks can be technically satisfied while economically misleading.</w:t>
       </w:r>
     </w:p>
     <w:p>
@@ -1107,13 +885,7 @@
         <w:pStyle w:val="BodyText"/>
       </w:pPr>
       <w:r>
-        <w:rPr>
-          <w:b/>
-        </w:rPr>
-        <w:t>Answer:</w:t>
-      </w:r>
-      <w:r>
-        <w:t xml:space="preserve"> Yes, especially fragile post-gap or thin-book states.</w:t>
+        <w:t>Yes, especially fragile post-gap or thin-book states.</w:t>
       </w:r>
     </w:p>
     <w:p>
@@ -1129,13 +901,7 @@
         <w:pStyle w:val="BodyText"/>
       </w:pPr>
       <w:r>
-        <w:rPr>
-          <w:b/>
-        </w:rPr>
-        <w:t>Answer:</w:t>
-      </w:r>
-      <w:r>
-        <w:t xml:space="preserve"> Yes, notably under overly strict deviation settings like </w:t>
+        <w:t xml:space="preserve">Yes, notably under overly strict deviation settings like </w:t>
       </w:r>
       <w:r>
         <w:rPr>
@@ -1179,13 +945,7 @@
         <w:pStyle w:val="BodyText"/>
       </w:pPr>
       <w:r>
-        <w:rPr>
-          <w:b/>
-        </w:rPr>
-        <w:t>Answer:</w:t>
-      </w:r>
-      <w:r>
-        <w:t xml:space="preserve"> Monitoring and analytics for positions/fees; not an execution-guarantee oracle.</w:t>
+        <w:t>Monitoring and analytics for positions/fees; not an execution-guarantee oracle.</w:t>
       </w:r>
     </w:p>
     <w:p>
@@ -1201,13 +961,7 @@
         <w:pStyle w:val="BodyText"/>
       </w:pPr>
       <w:r>
-        <w:rPr>
-          <w:b/>
-        </w:rPr>
-        <w:t>Answer:</w:t>
-      </w:r>
-      <w:r>
-        <w:t xml:space="preserve"> Safe for monitoring, risky as sole pricing authority for mint/redeem fairness.</w:t>
+        <w:t>Safe for monitoring, risky as sole pricing authority for mint/redeem fairness.</w:t>
       </w:r>
     </w:p>
     <w:p>
@@ -1223,13 +977,7 @@
         <w:pStyle w:val="BodyText"/>
       </w:pPr>
       <w:r>
-        <w:rPr>
-          <w:b/>
-        </w:rPr>
-        <w:t>Answer:</w:t>
-      </w:r>
-      <w:r>
-        <w:t xml:space="preserve"> It can do either; in practice it often appears optimistic because it omits real-time unwind costs and execution impact.</w:t>
+        <w:t>It can do either; in practice it often appears optimistic because it omits real-time unwind costs and execution impact.</w:t>
       </w:r>
     </w:p>
     <w:p>
@@ -1245,13 +993,7 @@
         <w:pStyle w:val="BodyText"/>
       </w:pPr>
       <w:r>
-        <w:rPr>
-          <w:b/>
-        </w:rPr>
-        <w:t>Answer:</w:t>
-      </w:r>
-      <w:r>
-        <w:t xml:space="preserve"> Directionally yes under expected assumptions, but still not a substitute for executable-value estimation.</w:t>
+        <w:t>Directionally yes under expected assumptions, but still not a substitute for executable-value estimation.</w:t>
       </w:r>
     </w:p>
     <w:p>
@@ -1267,13 +1009,7 @@
         <w:pStyle w:val="BodyText"/>
       </w:pPr>
       <w:r>
-        <w:rPr>
-          <w:b/>
-        </w:rPr>
-        <w:t>Answer:</w:t>
-      </w:r>
-      <w:r>
-        <w:t xml:space="preserve"> Drift can become meaningful during volatile or delayed-maintenance periods and should be treated as a first-class risk metric.</w:t>
+        <w:t>Drift can become meaningful during volatile or delayed-maintenance periods and should be treated as a first-class risk metric.</w:t>
       </w:r>
     </w:p>
     <w:p>
@@ -1289,13 +1025,7 @@
         <w:pStyle w:val="BodyText"/>
       </w:pPr>
       <w:r>
-        <w:rPr>
-          <w:b/>
-        </w:rPr>
-        <w:t>Answer:</w:t>
-      </w:r>
-      <w:r>
-        <w:t xml:space="preserve"> Use a conservative hybrid model: accounting base, freshness checks, executable-liquidity context, and explicit haircut policy.</w:t>
+        <w:t>Use a conservative hybrid model: accounting base, freshness checks, executable-liquidity context, and explicit haircut policy.</w:t>
       </w:r>
     </w:p>
     <w:p>
@@ -1311,13 +1041,7 @@
         <w:pStyle w:val="BodyText"/>
       </w:pPr>
       <w:r>
-        <w:rPr>
-          <w:b/>
-        </w:rPr>
-        <w:t>Answer:</w:t>
-      </w:r>
-      <w:r>
-        <w:t xml:space="preserve"> Pure optimistic mark-to-market without freshness, liquidity, or unwind-path controls.</w:t>
+        <w:t>Pure optimistic mark-to-market without freshness, liquidity, or unwind-path controls.</w:t>
       </w:r>
     </w:p>
     <w:p>
@@ -1343,13 +1067,7 @@
         <w:pStyle w:val="BodyText"/>
       </w:pPr>
       <w:r>
-        <w:rPr>
-          <w:b/>
-        </w:rPr>
-        <w:t>Answer:</w:t>
-      </w:r>
-      <w:r>
-        <w:t xml:space="preserve"> A conservative redeemable-equivalent estimate, not a best-case mark.</w:t>
+        <w:t>A conservative redeemable-equivalent estimate, not a best-case mark.</w:t>
       </w:r>
     </w:p>
     <w:p>
@@ -1365,13 +1083,7 @@
         <w:pStyle w:val="BodyText"/>
       </w:pPr>
       <w:r>
-        <w:rPr>
-          <w:b/>
-        </w:rPr>
-        <w:t>Answer:</w:t>
-      </w:r>
-      <w:r>
-        <w:t xml:space="preserve"> Hybrid with conservative bounds is safest.</w:t>
+        <w:t>Hybrid with conservative bounds is safest.</w:t>
       </w:r>
     </w:p>
     <w:p>
@@ -1387,13 +1099,7 @@
         <w:pStyle w:val="BodyText"/>
       </w:pPr>
       <w:r>
-        <w:rPr>
-          <w:b/>
-        </w:rPr>
-        <w:t>Answer:</w:t>
-      </w:r>
-      <w:r>
-        <w:t xml:space="preserve"> Lower-bound/conservative valuation to prevent underpriced share minting.</w:t>
+        <w:t>Lower-bound/conservative valuation to prevent underpriced share minting.</w:t>
       </w:r>
     </w:p>
     <w:p>
@@ -1409,13 +1115,7 @@
         <w:pStyle w:val="BodyText"/>
       </w:pPr>
       <w:r>
-        <w:rPr>
-          <w:b/>
-        </w:rPr>
-        <w:t>Answer:</w:t>
-      </w:r>
-      <w:r>
-        <w:t xml:space="preserve"> Queue-aware executable estimate to avoid over-promising immediate value.</w:t>
+        <w:t>Queue-aware executable estimate to avoid over-promising immediate value.</w:t>
       </w:r>
     </w:p>
     <w:p>
@@ -1431,13 +1131,7 @@
         <w:pStyle w:val="BodyText"/>
       </w:pPr>
       <w:r>
-        <w:rPr>
-          <w:b/>
-        </w:rPr>
-        <w:t>Answer:</w:t>
-      </w:r>
-      <w:r>
-        <w:t xml:space="preserve"> At mint/redeem conversion boundaries when accounting value materially exceeds realizable exit value.</w:t>
+        <w:t>At mint/redeem conversion boundaries when accounting value materially exceeds realizable exit value.</w:t>
       </w:r>
     </w:p>
     <w:p>
@@ -1461,13 +1155,7 @@
         <w:pStyle w:val="BodyText"/>
       </w:pPr>
       <w:r>
-        <w:rPr>
-          <w:b/>
-        </w:rPr>
-        <w:t>Answer:</w:t>
-      </w:r>
-      <w:r>
-        <w:t xml:space="preserve"> Manager can set thresholds, periods, TWAP/deviation controls, weights, supply cap, pending manager fee, manager handoff, delegate, fee collection, emergency burn, and allowed sweep operations.</w:t>
+        <w:t>Manager can set thresholds, periods, TWAP/deviation controls, weights, supply cap, pending manager fee, manager handoff, delegate, fee collection, emergency burn, and allowed sweep operations.</w:t>
       </w:r>
     </w:p>
     <w:p>
@@ -1483,13 +1171,7 @@
         <w:pStyle w:val="BodyText"/>
       </w:pPr>
       <w:r>
-        <w:rPr>
-          <w:b/>
-        </w:rPr>
-        <w:t>Answer:</w:t>
-      </w:r>
-      <w:r>
-        <w:t xml:space="preserve"> Governance can update protocol fee, control governance handoff, and exercise protocol-level fee authority.</w:t>
+        <w:t>Governance can update protocol fee, control governance handoff, and exercise protocol-level fee authority.</w:t>
       </w:r>
     </w:p>
     <w:p>
@@ -1505,13 +1187,7 @@
         <w:pStyle w:val="BodyText"/>
       </w:pPr>
       <w:r>
-        <w:rPr>
-          <w:b/>
-        </w:rPr>
-        <w:t>Answer:</w:t>
-      </w:r>
-      <w:r>
-        <w:t xml:space="preserve"> Execute rebalances only; broader policy mutation remains manager/governance-controlled.</w:t>
+        <w:t>Execute rebalances only; broader policy mutation remains manager/governance-controlled.</w:t>
       </w:r>
     </w:p>
     <w:p>
@@ -1537,13 +1213,7 @@
         <w:pStyle w:val="BodyText"/>
       </w:pPr>
       <w:r>
-        <w:rPr>
-          <w:b/>
-        </w:rPr>
-        <w:t>Answer:</w:t>
-      </w:r>
-      <w:r>
-        <w:t xml:space="preserve"> Force liquidity removal/reset under stress, which can protect or harm depending on timing and market depth.</w:t>
+        <w:t>Force liquidity removal/reset under stress, which can protect or harm depending on timing and market depth.</w:t>
       </w:r>
     </w:p>
     <w:p>
@@ -1569,13 +1239,7 @@
         <w:pStyle w:val="BodyText"/>
       </w:pPr>
       <w:r>
-        <w:rPr>
-          <w:b/>
-        </w:rPr>
-        <w:t>Answer:</w:t>
-      </w:r>
-      <w:r>
-        <w:t xml:space="preserve"> It is relatively well-scoped when token0/token1 exclusions are enforced; still requires role hygiene.</w:t>
+        <w:t>It is relatively well-scoped when token0/token1 exclusions are enforced; still requires role hygiene.</w:t>
       </w:r>
     </w:p>
     <w:p>
@@ -1591,13 +1255,7 @@
         <w:pStyle w:val="BodyText"/>
       </w:pPr>
       <w:r>
-        <w:rPr>
-          <w:b/>
-        </w:rPr>
-        <w:t>Answer:</w:t>
-      </w:r>
-      <w:r>
-        <w:t xml:space="preserve"> Yes, materially. Economic harm can occur without violating code-level invariants.</w:t>
+        <w:t>Yes, materially. Economic harm can occur without violating code-level invariants.</w:t>
       </w:r>
     </w:p>
     <w:p>
@@ -1613,13 +1271,7 @@
         <w:pStyle w:val="BodyText"/>
       </w:pPr>
       <w:r>
-        <w:rPr>
-          <w:b/>
-        </w:rPr>
-        <w:t>Answer:</w:t>
-      </w:r>
-      <w:r>
-        <w:t xml:space="preserve"> Yes. Timing around flow windows can create discontinuous user outcomes.</w:t>
+        <w:t>Yes. Timing around flow windows can create discontinuous user outcomes.</w:t>
       </w:r>
     </w:p>
     <w:p>
@@ -1635,13 +1287,7 @@
         <w:pStyle w:val="BodyText"/>
       </w:pPr>
       <w:r>
-        <w:rPr>
-          <w:b/>
-        </w:rPr>
-        <w:t>Answer:</w:t>
-      </w:r>
-      <w:r>
-        <w:t xml:space="preserve"> Yes. Two-step handoffs reduce accidental mistakes but introduce transition risk windows.</w:t>
+        <w:t>Yes. Two-step handoffs reduce accidental mistakes but introduce transition risk windows.</w:t>
       </w:r>
     </w:p>
     <w:p>
@@ -1657,13 +1303,7 @@
         <w:pStyle w:val="BodyText"/>
       </w:pPr>
       <w:r>
-        <w:rPr>
-          <w:b/>
-        </w:rPr>
-        <w:t>Answer:</w:t>
-      </w:r>
-      <w:r>
-        <w:t xml:space="preserve"> Yes, economically.</w:t>
+        <w:t>Yes, economically.</w:t>
       </w:r>
     </w:p>
     <w:p>
@@ -1679,13 +1319,7 @@
         <w:pStyle w:val="BodyText"/>
       </w:pPr>
       <w:r>
-        <w:rPr>
-          <w:b/>
-        </w:rPr>
-        <w:t>Answer:</w:t>
-      </w:r>
-      <w:r>
-        <w:t xml:space="preserve"> Disclose active-management dependence, mutable policy risk, accounting-vs-realizable divergence, queue/latency risk, and automation/oracle trust-boundary dependence.</w:t>
+        <w:t>Disclose active-management dependence, mutable policy risk, accounting-vs-realizable divergence, queue/latency risk, and automation/oracle trust-boundary dependence.</w:t>
       </w:r>
     </w:p>
     <w:p>
@@ -1709,13 +1343,7 @@
         <w:pStyle w:val="BodyText"/>
       </w:pPr>
       <w:r>
-        <w:rPr>
-          <w:b/>
-        </w:rPr>
-        <w:t>Answer:</w:t>
-      </w:r>
-      <w:r>
-        <w:t xml:space="preserve"> Core happy paths, role gates, rebalance guards, valuation readiness checks, fallback paths, wrapper normalization, and ShareOFT validation behavior.</w:t>
+        <w:t>Core happy paths, role gates, rebalance guards, valuation readiness checks, fallback paths, wrapper normalization, and ShareOFT validation behavior.</w:t>
       </w:r>
     </w:p>
     <w:p>
@@ -1731,13 +1359,7 @@
         <w:pStyle w:val="BodyText"/>
       </w:pPr>
       <w:r>
-        <w:rPr>
-          <w:b/>
-        </w:rPr>
-        <w:t>Answer:</w:t>
-      </w:r>
-      <w:r>
-        <w:t xml:space="preserve"> Adversarial MEV conditions, stress exit fairness, prolonged automation outage behavior, and realistic market-impact unwind scenarios.</w:t>
+        <w:t>Adversarial MEV conditions, stress exit fairness, prolonged automation outage behavior, and realistic market-impact unwind scenarios.</w:t>
       </w:r>
     </w:p>
     <w:p>
@@ -1753,13 +1375,7 @@
         <w:pStyle w:val="BodyText"/>
       </w:pPr>
       <w:r>
-        <w:rPr>
-          <w:b/>
-        </w:rPr>
-        <w:t>Answer:</w:t>
-      </w:r>
-      <w:r>
-        <w:t xml:space="preserve"> Yes. Missing depth includes stressed exits, gap regimes, adverse selection, public rebalance abuse modeling, and full E2E outage/race testing.</w:t>
+        <w:t>Yes. Missing depth includes stressed exits, gap regimes, adverse selection, public rebalance abuse modeling, and full E2E outage/race testing.</w:t>
       </w:r>
     </w:p>
     <w:p>
@@ -1775,13 +1391,7 @@
         <w:pStyle w:val="BodyText"/>
       </w:pPr>
       <w:r>
-        <w:rPr>
-          <w:b/>
-        </w:rPr>
-        <w:t>Answer:</w:t>
-      </w:r>
-      <w:r>
-        <w:t xml:space="preserve"> Rebalance sandwich edges, trend PnL decomposition, TWAP threshold manipulation, stale-poke mint fairness, wrapper queue-path parity, queue claim drift, persistent USDC unwind failure, dedupe race, owner-index drift recovery, and bundler/paymaster outage behavior.</w:t>
+        <w:t>Rebalance sandwich edges, trend PnL decomposition, TWAP threshold manipulation, stale-poke mint fairness, wrapper queue-path parity, queue claim drift, persistent USDC unwind failure, dedupe race, owner-index drift recovery, and bundler/paymaster outage behavior.</w:t>
       </w:r>
     </w:p>
     <w:p>
@@ -1805,13 +1415,7 @@
         <w:pStyle w:val="BodyText"/>
       </w:pPr>
       <w:r>
-        <w:rPr>
-          <w:b/>
-        </w:rPr>
-        <w:t>Answer:</w:t>
-      </w:r>
-      <w:r>
-        <w:t xml:space="preserve"> 4626fun deploys/uses native Charm vaults via </w:t>
+        <w:t xml:space="preserve">4626fun deploys/uses native Charm vaults via </w:t>
       </w:r>
       <w:r>
         <w:rPr>
@@ -1857,13 +1461,7 @@
         <w:pStyle w:val="BodyText"/>
       </w:pPr>
       <w:r>
-        <w:rPr>
-          <w:b/>
-        </w:rPr>
-        <w:t>Answer:</w:t>
-      </w:r>
-      <w:r>
-        <w:t xml:space="preserve"> Additional assumptions include oracle freshness for USDC conversion, queue liveness, wrapper normalization correctness, and CSW/automation execution reliability.</w:t>
+        <w:t>Additional assumptions include oracle freshness for USDC conversion, queue liveness, wrapper normalization correctness, and CSW/automation execution reliability.</w:t>
       </w:r>
     </w:p>
     <w:p>
@@ -1879,13 +1477,7 @@
         <w:pStyle w:val="BodyText"/>
       </w:pPr>
       <w:r>
-        <w:rPr>
-          <w:b/>
-        </w:rPr>
-        <w:t>Answer:</w:t>
-      </w:r>
-      <w:r>
-        <w:t xml:space="preserve"> In previews, </w:t>
+        <w:t xml:space="preserve">In previews, </w:t>
       </w:r>
       <w:r>
         <w:rPr>
@@ -1911,13 +1503,7 @@
         <w:pStyle w:val="BodyText"/>
       </w:pPr>
       <w:r>
-        <w:rPr>
-          <w:b/>
-        </w:rPr>
-        <w:t>Answer:</w:t>
-      </w:r>
-      <w:r>
-        <w:t xml:space="preserve"> Yes.</w:t>
+        <w:t>Yes.</w:t>
       </w:r>
     </w:p>
     <w:p>
@@ -1933,13 +1519,7 @@
         <w:pStyle w:val="BodyText"/>
       </w:pPr>
       <w:r>
-        <w:rPr>
-          <w:b/>
-        </w:rPr>
-        <w:t>Answer:</w:t>
-      </w:r>
-      <w:r>
-        <w:t xml:space="preserve"> Yes.</w:t>
+        <w:t>Yes.</w:t>
       </w:r>
     </w:p>
     <w:p>
@@ -1955,13 +1535,7 @@
         <w:pStyle w:val="BodyText"/>
       </w:pPr>
       <w:r>
-        <w:rPr>
-          <w:b/>
-        </w:rPr>
-        <w:t>Answer:</w:t>
-      </w:r>
-      <w:r>
-        <w:t xml:space="preserve"> Yes, and this is a high-severity integration risk.</w:t>
+        <w:t>Yes, and this is a high-severity integration risk.</w:t>
       </w:r>
     </w:p>
     <w:p>
@@ -1977,13 +1551,7 @@
         <w:pStyle w:val="BodyText"/>
       </w:pPr>
       <w:r>
-        <w:rPr>
-          <w:b/>
-        </w:rPr>
-        <w:t>Answer:</w:t>
-      </w:r>
-      <w:r>
-        <w:t xml:space="preserve"> It can reduce timing games if valuation is robust, but increases unfairness if batch valuation is stale/optimistic.</w:t>
+        <w:t>It can reduce timing games if valuation is robust, but increases unfairness if batch valuation is stale/optimistic.</w:t>
       </w:r>
     </w:p>
     <w:p>
@@ -1999,13 +1567,7 @@
         <w:pStyle w:val="BodyText"/>
       </w:pPr>
       <w:r>
-        <w:rPr>
-          <w:b/>
-        </w:rPr>
-        <w:t>Answer:</w:t>
-      </w:r>
-      <w:r>
-        <w:t xml:space="preserve"> It shifts risk from immediate transactors toward queued users and remaining holders across delay windows.</w:t>
+        <w:t>It shifts risk from immediate transactors toward queued users and remaining holders across delay windows.</w:t>
       </w:r>
     </w:p>
     <w:p>
@@ -2029,13 +1591,7 @@
         <w:pStyle w:val="BodyText"/>
       </w:pPr>
       <w:r>
-        <w:rPr>
-          <w:b/>
-        </w:rPr>
-        <w:t>Answer:</w:t>
-      </w:r>
-      <w:r>
-        <w:t xml:space="preserve"> Hybrid today: direct workflow triggers, queue-based execution, and event-driven enqueueing coexist.</w:t>
+        <w:t>Hybrid today: direct workflow triggers, queue-based execution, and event-driven enqueueing coexist.</w:t>
       </w:r>
     </w:p>
     <w:p>
@@ -2051,13 +1607,7 @@
         <w:pStyle w:val="BodyText"/>
       </w:pPr>
       <w:r>
-        <w:rPr>
-          <w:b/>
-        </w:rPr>
-        <w:t>Answer:</w:t>
-      </w:r>
-      <w:r>
-        <w:t xml:space="preserve"> Auth checks, hard guard constraints, and accounting invariants.</w:t>
+        <w:t>Auth checks, hard guard constraints, and accounting invariants.</w:t>
       </w:r>
     </w:p>
     <w:p>
@@ -2073,13 +1623,7 @@
         <w:pStyle w:val="BodyText"/>
       </w:pPr>
       <w:r>
-        <w:rPr>
-          <w:b/>
-        </w:rPr>
-        <w:t>Answer:</w:t>
-      </w:r>
-      <w:r>
-        <w:t xml:space="preserve"> Monitoring, queueing, validation, simulation, and deterministic relay/execution orchestration.</w:t>
+        <w:t>Monitoring, queueing, validation, simulation, and deterministic relay/execution orchestration.</w:t>
       </w:r>
     </w:p>
     <w:p>
@@ -2095,13 +1639,7 @@
         <w:pStyle w:val="BodyText"/>
       </w:pPr>
       <w:r>
-        <w:rPr>
-          <w:b/>
-        </w:rPr>
-        <w:t>Answer:</w:t>
-      </w:r>
-      <w:r>
-        <w:t xml:space="preserve"> Authz, fee/threshold mutation, emergency writes, and any safety-critical execution gating.</w:t>
+        <w:t>Authz, fee/threshold mutation, emergency writes, and any safety-critical execution gating.</w:t>
       </w:r>
     </w:p>
     <w:p>
@@ -2117,13 +1655,7 @@
         <w:pStyle w:val="BodyText"/>
       </w:pPr>
       <w:r>
-        <w:rPr>
-          <w:b/>
-        </w:rPr>
-        <w:t>Answer:</w:t>
-      </w:r>
-      <w:r>
-        <w:t xml:space="preserve"> Yes to monitor/queue/validate/simulate/gate; direct execution only as tightly constrained deterministic relay.</w:t>
+        <w:t>Yes to monitor/queue/validate/simulate/gate; direct execution only as tightly constrained deterministic relay.</w:t>
       </w:r>
     </w:p>
     <w:p>
@@ -2139,13 +1671,7 @@
         <w:pStyle w:val="BodyText"/>
       </w:pPr>
       <w:r>
-        <w:rPr>
-          <w:b/>
-        </w:rPr>
-        <w:t>Answer:</w:t>
-      </w:r>
-      <w:r>
-        <w:t xml:space="preserve"> It improves observability and control surfaces, but current multi-path topology still adds avoidable complexity.</w:t>
+        <w:t>It improves observability and control surfaces, but current multi-path topology still adds avoidable complexity.</w:t>
       </w:r>
     </w:p>
     <w:p>
@@ -2161,13 +1687,7 @@
         <w:pStyle w:val="BodyText"/>
       </w:pPr>
       <w:r>
-        <w:rPr>
-          <w:b/>
-        </w:rPr>
-        <w:t>Answer:</w:t>
-      </w:r>
-      <w:r>
-        <w:t xml:space="preserve"> Duplicate triggers, queue staleness, owner-index drift, bundler/paymaster outage, and cross-service API/DB coupling failures.</w:t>
+        <w:t>Duplicate triggers, queue staleness, owner-index drift, bundler/paymaster outage, and cross-service API/DB coupling failures.</w:t>
       </w:r>
     </w:p>
     <w:p>
@@ -2183,13 +1703,7 @@
         <w:pStyle w:val="BodyText"/>
       </w:pPr>
       <w:r>
-        <w:rPr>
-          <w:b/>
-        </w:rPr>
-        <w:t>Answer:</w:t>
-      </w:r>
-      <w:r>
-        <w:t xml:space="preserve"> One canonical producer + one canonical executor with strict idempotency, replay protection, and deterministic policy checks.</w:t>
+        <w:t>One canonical producer + one canonical executor with strict idempotency, replay protection, and deterministic policy checks.</w:t>
       </w:r>
     </w:p>
     <w:p>
@@ -2213,13 +1727,7 @@
         <w:pStyle w:val="BodyText"/>
       </w:pPr>
       <w:r>
-        <w:rPr>
-          <w:b/>
-        </w:rPr>
-        <w:t>Answer:</w:t>
-      </w:r>
-      <w:r>
-        <w:t xml:space="preserve"> Attack path: external actor times public </w:t>
+        <w:t xml:space="preserve">Attack path: external actor times public </w:t>
       </w:r>
       <w:r>
         <w:rPr>
@@ -2255,13 +1763,7 @@
         <w:pStyle w:val="BodyText"/>
       </w:pPr>
       <w:r>
-        <w:rPr>
-          <w:b/>
-        </w:rPr>
-        <w:t>Answer:</w:t>
-      </w:r>
-      <w:r>
-        <w:t xml:space="preserve"> Attack path: manager executes rule-compliant but economically poor rebalance. Impact: value loss from inventory repositioning. Detection: policy-change + rebalance telemetry divergence from baseline. Mitigation: timelock, bounded parameter changes, dual-control approvals.</w:t>
+        <w:t>Attack path: manager executes rule-compliant but economically poor rebalance. Impact: value loss from inventory repositioning. Detection: policy-change + rebalance telemetry divergence from baseline. Mitigation: timelock, bounded parameter changes, dual-control approvals.</w:t>
       </w:r>
     </w:p>
     <w:p>
@@ -2277,13 +1779,7 @@
         <w:pStyle w:val="BodyText"/>
       </w:pPr>
       <w:r>
-        <w:rPr>
-          <w:b/>
-        </w:rPr>
-        <w:t>Answer:</w:t>
-      </w:r>
-      <w:r>
-        <w:t xml:space="preserve"> Attack path: searchers position around predictable rebalance windows and range resets. Impact: MEV extraction and sustained strategy drag. Detection: abnormal before/after swap patterns and post-rebalance drift. Mitigation: private relay, timing jitter, stronger eligibility gating.</w:t>
+        <w:t>Attack path: searchers position around predictable rebalance windows and range resets. Impact: MEV extraction and sustained strategy drag. Detection: abnormal before/after swap patterns and post-rebalance drift. Mitigation: private relay, timing jitter, stronger eligibility gating.</w:t>
       </w:r>
     </w:p>
     <w:p>
@@ -2299,13 +1795,7 @@
         <w:pStyle w:val="BodyText"/>
       </w:pPr>
       <w:r>
-        <w:rPr>
-          <w:b/>
-        </w:rPr>
-        <w:t>Answer:</w:t>
-      </w:r>
-      <w:r>
-        <w:t xml:space="preserve"> Attack path: deposit into stale mark window before accounting catches up. Impact: cohort unfairness (value transfer). Detection: entry timing clusters around stale valuation windows. Mitigation: conservative mint valuation and freshness gating.</w:t>
+        <w:t>Attack path: deposit into stale mark window before accounting catches up. Impact: cohort unfairness (value transfer). Detection: entry timing clusters around stale valuation windows. Mitigation: conservative mint valuation and freshness gating.</w:t>
       </w:r>
     </w:p>
     <w:p>
@@ -2321,13 +1811,7 @@
         <w:pStyle w:val="BodyText"/>
       </w:pPr>
       <w:r>
-        <w:rPr>
-          <w:b/>
-        </w:rPr>
-        <w:t>Answer:</w:t>
-      </w:r>
-      <w:r>
-        <w:t xml:space="preserve"> Attack path: user exits during temporary accounting advantage window. Impact: remaining holders absorb relative loss. Detection: clustered exits immediately after fee realization events. Mitigation: anti-timing controls and queue-aware policy.</w:t>
+        <w:t>Attack path: user exits during temporary accounting advantage window. Impact: remaining holders absorb relative loss. Detection: clustered exits immediately after fee realization events. Mitigation: anti-timing controls and queue-aware policy.</w:t>
       </w:r>
     </w:p>
     <w:p>
@@ -2343,13 +1827,7 @@
         <w:pStyle w:val="BodyText"/>
       </w:pPr>
       <w:r>
-        <w:rPr>
-          <w:b/>
-        </w:rPr>
-        <w:t>Answer:</w:t>
-      </w:r>
-      <w:r>
-        <w:t xml:space="preserve"> Attack path: tiny transactions force state refresh and alter who captures fees. Impact: fairness distortion, usually medium severity. Detection: anomalous micro-deposit patterns around fee realization. Mitigation: deterministic fee update cadence or batching policy.</w:t>
+        <w:t>Attack path: tiny transactions force state refresh and alter who captures fees. Impact: fairness distortion, usually medium severity. Detection: anomalous micro-deposit patterns around fee realization. Mitigation: deterministic fee update cadence or batching policy.</w:t>
       </w:r>
     </w:p>
     <w:p>
@@ -2365,13 +1843,7 @@
         <w:pStyle w:val="BodyText"/>
       </w:pPr>
       <w:r>
-        <w:rPr>
-          <w:b/>
-        </w:rPr>
-        <w:t>Answer:</w:t>
-      </w:r>
-      <w:r>
-        <w:t xml:space="preserve"> Attack path: stale oracle/conversion inputs feed optimistic mint/redeem math. Impact: unfair transfer and redemption expectation mismatch. Detection: stale-price telemetry with high flow. Mitigation: hard freshness gates and valuation haircuts.</w:t>
+        <w:t>Attack path: stale oracle/conversion inputs feed optimistic mint/redeem math. Impact: unfair transfer and redemption expectation mismatch. Detection: stale-price telemetry with high flow. Mitigation: hard freshness gates and valuation haircuts.</w:t>
       </w:r>
     </w:p>
     <w:p>
@@ -2387,13 +1859,7 @@
         <w:pStyle w:val="BodyText"/>
       </w:pPr>
       <w:r>
-        <w:rPr>
-          <w:b/>
-        </w:rPr>
-        <w:t>Answer:</w:t>
-      </w:r>
-      <w:r>
-        <w:t xml:space="preserve"> Attack path: conversion uses optimistic accounting instead of executable value. Impact: silent fairness erosion, can resemble insolvency behavior in stress. Detection: widening gap between accounting NAV and realized exit outcomes. Mitigation: pessimistic executable valuation model.</w:t>
+        <w:t>Attack path: conversion uses optimistic accounting instead of executable value. Impact: silent fairness erosion, can resemble insolvency behavior in stress. Detection: widening gap between accounting NAV and realized exit outcomes. Mitigation: pessimistic executable valuation model.</w:t>
       </w:r>
     </w:p>
     <w:p>
@@ -2409,13 +1875,7 @@
         <w:pStyle w:val="BodyText"/>
       </w:pPr>
       <w:r>
-        <w:rPr>
-          <w:b/>
-        </w:rPr>
-        <w:t>Answer:</w:t>
-      </w:r>
-      <w:r>
-        <w:t xml:space="preserve"> Attack path: informed flow trades against predictable residual side. Impact: directional inventory damage. Detection: repeated adverse fills near residual placement windows. Mitigation: adaptive residual sizing/placement policy.</w:t>
+        <w:t>Attack path: informed flow trades against predictable residual side. Impact: directional inventory damage. Detection: repeated adverse fills near residual placement windows. Mitigation: adaptive residual sizing/placement policy.</w:t>
       </w:r>
     </w:p>
     <w:p>
@@ -2431,13 +1891,7 @@
         <w:pStyle w:val="BodyText"/>
       </w:pPr>
       <w:r>
-        <w:rPr>
-          <w:b/>
-        </w:rPr>
-        <w:t>Answer:</w:t>
-      </w:r>
-      <w:r>
-        <w:t xml:space="preserve"> Attack path: persistent directional flow repeatedly selects against LP inventory. Impact: net value bleed despite fee income. Detection: trend-regime underperformance decomposition (fees vs inventory loss). Mitigation: faster adaptive rebalance + tighter trend controls.</w:t>
+        <w:t>Attack path: persistent directional flow repeatedly selects against LP inventory. Impact: net value bleed despite fee income. Detection: trend-regime underperformance decomposition (fees vs inventory loss). Mitigation: faster adaptive rebalance + tighter trend controls.</w:t>
       </w:r>
     </w:p>
     <w:p>
@@ -2453,13 +1907,7 @@
         <w:pStyle w:val="BodyText"/>
       </w:pPr>
       <w:r>
-        <w:rPr>
-          <w:b/>
-        </w:rPr>
-        <w:t>Answer:</w:t>
-      </w:r>
-      <w:r>
-        <w:t xml:space="preserve"> Attack path: near-threshold manipulation in low-depth windows. Impact: wrong rebalance decision pass/fail. Detection: boundary-edge triggers under thin-liquidity periods. Mitigation: longer windows, depth/liquidity-aware gating.</w:t>
+        <w:t>Attack path: near-threshold manipulation in low-depth windows. Impact: wrong rebalance decision pass/fail. Detection: boundary-edge triggers under thin-liquidity periods. Mitigation: longer windows, depth/liquidity-aware gating.</w:t>
       </w:r>
     </w:p>
     <w:p>
@@ -2475,13 +1923,7 @@
         <w:pStyle w:val="BodyText"/>
       </w:pPr>
       <w:r>
-        <w:rPr>
-          <w:b/>
-        </w:rPr>
-        <w:t>Answer:</w:t>
-      </w:r>
-      <w:r>
-        <w:t xml:space="preserve"> Attack path: trigger rebalance at technically valid but economically fragile boundaries. Impact: poor placement and follow-on losses. Detection: boundary-aligned rebalances with immediate adverse drift. Mitigation: add volatility/impact-aware veto conditions.</w:t>
+        <w:t>Attack path: trigger rebalance at technically valid but economically fragile boundaries. Impact: poor placement and follow-on losses. Detection: boundary-aligned rebalances with immediate adverse drift. Mitigation: add volatility/impact-aware veto conditions.</w:t>
       </w:r>
     </w:p>
     <w:p>
@@ -2497,13 +1939,7 @@
         <w:pStyle w:val="BodyText"/>
       </w:pPr>
       <w:r>
-        <w:rPr>
-          <w:b/>
-        </w:rPr>
-        <w:t>Answer:</w:t>
-      </w:r>
-      <w:r>
-        <w:t xml:space="preserve"> Attack path: schedule pending manager fee activation around expected flow windows. Impact: fairness/trust issue, medium severity. Detection: fee-change timing correlation with large user flows. Mitigation: notice windows, timelock, governance transparency.</w:t>
+        <w:t>Attack path: schedule pending manager fee activation around expected flow windows. Impact: fairness/trust issue, medium severity. Detection: fee-change timing correlation with large user flows. Mitigation: notice windows, timelock, governance transparency.</w:t>
       </w:r>
     </w:p>
     <w:p>
@@ -2519,13 +1955,7 @@
         <w:pStyle w:val="BodyText"/>
       </w:pPr>
       <w:r>
-        <w:rPr>
-          <w:b/>
-        </w:rPr>
-        <w:t>Answer:</w:t>
-      </w:r>
-      <w:r>
-        <w:t xml:space="preserve"> Attack path: governance times protocol fee changes around user activity. Impact: fairness discontinuity. Detection: governance-change and flow correlation monitoring. Mitigation: timelocked updates and explicit user notice.</w:t>
+        <w:t>Attack path: governance times protocol fee changes around user activity. Impact: fairness discontinuity. Detection: governance-change and flow correlation monitoring. Mitigation: timelocked updates and explicit user notice.</w:t>
       </w:r>
     </w:p>
     <w:p>
@@ -2551,13 +1981,7 @@
         <w:pStyle w:val="BodyText"/>
       </w:pPr>
       <w:r>
-        <w:rPr>
-          <w:b/>
-        </w:rPr>
-        <w:t>Answer:</w:t>
-      </w:r>
-      <w:r>
-        <w:t xml:space="preserve"> Attack path: emergency authority unwinds at poor market moment. Impact: direct value loss and liveness disruption. Detection: emergency-call audit logs and post-event PnL shock. Mitigation: restricted runbook, staged approvals, postmortem policy.</w:t>
+        <w:t>Attack path: emergency authority unwinds at poor market moment. Impact: direct value loss and liveness disruption. Detection: emergency-call audit logs and post-event PnL shock. Mitigation: restricted runbook, staged approvals, postmortem policy.</w:t>
       </w:r>
     </w:p>
     <w:p>
@@ -2573,13 +1997,7 @@
         <w:pStyle w:val="BodyText"/>
       </w:pPr>
       <w:r>
-        <w:rPr>
-          <w:b/>
-        </w:rPr>
-        <w:t>Answer:</w:t>
-      </w:r>
-      <w:r>
-        <w:t xml:space="preserve"> Attack path: keeper/queue/executor downtime stalls corrective operations. Impact: primarily liveness first, then economic drift/loss. Detection: missed SLO alerts, queue backlog growth. Mitigation: redundant executor path and tested failover runbook.</w:t>
+        <w:t>Attack path: keeper/queue/executor downtime stalls corrective operations. Impact: primarily liveness first, then economic drift/loss. Detection: missed SLO alerts, queue backlog growth. Mitigation: redundant executor path and tested failover runbook.</w:t>
       </w:r>
     </w:p>
     <w:p>
@@ -2595,13 +2013,7 @@
         <w:pStyle w:val="BodyText"/>
       </w:pPr>
       <w:r>
-        <w:rPr>
-          <w:b/>
-        </w:rPr>
-        <w:t>Answer:</w:t>
-      </w:r>
-      <w:r>
-        <w:t xml:space="preserve"> Attack path: overlapping producers/retries enqueue duplicates. Impact: churn, gas waste, potential extra MEV drag. Detection: duplicate dedupe-key collisions and repeated intents. Mitigation: single canonical producer and strict idempotent sink semantics.</w:t>
+        <w:t>Attack path: overlapping producers/retries enqueue duplicates. Impact: churn, gas waste, potential extra MEV drag. Detection: duplicate dedupe-key collisions and repeated intents. Mitigation: single canonical producer and strict idempotent sink semantics.</w:t>
       </w:r>
     </w:p>
     <w:p>
@@ -2617,13 +2029,7 @@
         <w:pStyle w:val="BodyText"/>
       </w:pPr>
       <w:r>
-        <w:rPr>
-          <w:b/>
-        </w:rPr>
-        <w:t>Answer:</w:t>
-      </w:r>
-      <w:r>
-        <w:t xml:space="preserve"> Attack path: UI/API presents accounting as executable reality. Impact: trust damage and economically harmful user decisions. Detection: realized-exit outcomes diverge from displayed promises. Mitigation: always show accounting vs executable-now vs queued-estimate separately.</w:t>
+        <w:t>Attack path: UI/API presents accounting as executable reality. Impact: trust damage and economically harmful user decisions. Detection: realized-exit outcomes diverge from displayed promises. Mitigation: always show accounting vs executable-now vs queued-estimate separately.</w:t>
       </w:r>
     </w:p>
     <w:p>
@@ -2647,13 +2053,7 @@
         <w:pStyle w:val="BodyText"/>
       </w:pPr>
       <w:r>
-        <w:rPr>
-          <w:b/>
-        </w:rPr>
-        <w:t>Answer:</w:t>
-      </w:r>
-      <w:r>
-        <w:t xml:space="preserve"> Users usually observe small drift; accounting and exit values remain close; impact is mostly mark-to-market and typically auto-recovers with normal cadence.</w:t>
+        <w:t>Users usually observe small drift; accounting and exit values remain close; impact is mostly mark-to-market and typically auto-recovers with normal cadence.</w:t>
       </w:r>
     </w:p>
     <w:p>
@@ -2669,13 +2069,7 @@
         <w:pStyle w:val="BodyText"/>
       </w:pPr>
       <w:r>
-        <w:rPr>
-          <w:b/>
-        </w:rPr>
-        <w:t>Answer:</w:t>
-      </w:r>
-      <w:r>
-        <w:t xml:space="preserve"> Accounting lags inventory reality; exits degrade before policy catches up; early exits outperform late exits; recovery is manager/keeper-dependent.</w:t>
+        <w:t>Accounting lags inventory reality; exits degrade before policy catches up; early exits outperform late exits; recovery is manager/keeper-dependent.</w:t>
       </w:r>
     </w:p>
     <w:p>
@@ -2691,13 +2085,7 @@
         <w:pStyle w:val="BodyText"/>
       </w:pPr>
       <w:r>
-        <w:rPr>
-          <w:b/>
-        </w:rPr>
-        <w:t>Answer:</w:t>
-      </w:r>
-      <w:r>
-        <w:t xml:space="preserve"> Accounting can remain optimistic while real unwind is expensive/limited; user pain shifts to late redeemers; losses become partly realized; recovery requires active intervention.</w:t>
+        <w:t>Accounting can remain optimistic while real unwind is expensive/limited; user pain shifts to late redeemers; losses become partly realized; recovery requires active intervention.</w:t>
       </w:r>
     </w:p>
     <w:p>
@@ -2713,13 +2101,7 @@
         <w:pStyle w:val="BodyText"/>
       </w:pPr>
       <w:r>
-        <w:rPr>
-          <w:b/>
-        </w:rPr>
-        <w:t>Answer:</w:t>
-      </w:r>
-      <w:r>
-        <w:t xml:space="preserve"> Users see unstable performance and rebalance churn; accounting oscillates; extraction risk rises; recovery depends on tuned policy and disciplined execution.</w:t>
+        <w:t>Users see unstable performance and rebalance churn; accounting oscillates; extraction risk rises; recovery depends on tuned policy and disciplined execution.</w:t>
       </w:r>
     </w:p>
     <w:p>
@@ -2735,13 +2117,7 @@
         <w:pStyle w:val="BodyText"/>
       </w:pPr>
       <w:r>
-        <w:rPr>
-          <w:b/>
-        </w:rPr>
-        <w:t>Answer:</w:t>
-      </w:r>
-      <w:r>
-        <w:t xml:space="preserve"> Buffer/exit bottlenecks dominate; many users face delay/revert pressure; fairness degrades strongly; recovery depends on queue mechanics plus operator actions.</w:t>
+        <w:t>Buffer/exit bottlenecks dominate; many users face delay/revert pressure; fairness degrades strongly; recovery depends on queue mechanics plus operator actions.</w:t>
       </w:r>
     </w:p>
     <w:p>
@@ -2757,13 +2133,7 @@
         <w:pStyle w:val="BodyText"/>
       </w:pPr>
       <w:r>
-        <w:rPr>
-          <w:b/>
-        </w:rPr>
-        <w:t>Answer:</w:t>
-      </w:r>
-      <w:r>
-        <w:t xml:space="preserve"> Value divergence widens with delay length; user confidence and fairness decay; long delays can convert liveness risk into realized loss; recovery is operator-dependent.</w:t>
+        <w:t>Value divergence widens with delay length; user confidence and fairness decay; long delays can convert liveness risk into realized loss; recovery is operator-dependent.</w:t>
       </w:r>
     </w:p>
     <w:p>
@@ -2779,13 +2149,7 @@
         <w:pStyle w:val="BodyText"/>
       </w:pPr>
       <w:r>
-        <w:rPr>
-          <w:b/>
-        </w:rPr>
-        <w:t>Answer:</w:t>
-      </w:r>
-      <w:r>
-        <w:t xml:space="preserve"> Accounting under-realizes until refresh; users observe timing-sensitive fairness differences; usually recoverable once poke/rebalance occurs.</w:t>
+        <w:t>Accounting under-realizes until refresh; users observe timing-sensitive fairness differences; usually recoverable once poke/rebalance occurs.</w:t>
       </w:r>
     </w:p>
     <w:p>
@@ -2801,13 +2165,7 @@
         <w:pStyle w:val="BodyText"/>
       </w:pPr>
       <w:r>
-        <w:rPr>
-          <w:b/>
-        </w:rPr>
-        <w:t>Answer:</w:t>
-      </w:r>
-      <w:r>
-        <w:t xml:space="preserve"> Users observe regime shift and unstable predictability; accounting assumptions break; losses can become realized if changes are poor; recovery requires governance rollback/retune.</w:t>
+        <w:t>Users observe regime shift and unstable predictability; accounting assumptions break; losses can become realized if changes are poor; recovery requires governance rollback/retune.</w:t>
       </w:r>
     </w:p>
     <w:p>
@@ -2823,13 +2181,7 @@
         <w:pStyle w:val="BodyText"/>
       </w:pPr>
       <w:r>
-        <w:rPr>
-          <w:b/>
-        </w:rPr>
-        <w:t>Answer:</w:t>
-      </w:r>
-      <w:r>
-        <w:t xml:space="preserve"> Users experience discontinuous economics despite intact accounting math; fairness/trust impact is medium; recovery is policy/process, not automatic.</w:t>
+        <w:t>Users experience discontinuous economics despite intact accounting math; fairness/trust impact is medium; recovery is policy/process, not automatic.</w:t>
       </w:r>
     </w:p>
     <w:p>
@@ -2845,13 +2197,7 @@
         <w:pStyle w:val="BodyText"/>
       </w:pPr>
       <w:r>
-        <w:rPr>
-          <w:b/>
-        </w:rPr>
-        <w:t>Answer:</w:t>
-      </w:r>
-      <w:r>
-        <w:t xml:space="preserve"> Smooth displayed values hide execution mismatch; mint/redeem fairness can fail; affected cohorts bear cost; recovery requires strict freshness gates and repricing policy.</w:t>
+        <w:t>Smooth displayed values hide execution mismatch; mint/redeem fairness can fail; affected cohorts bear cost; recovery requires strict freshness gates and repricing policy.</w:t>
       </w:r>
     </w:p>
     <w:p>
@@ -2867,13 +2213,7 @@
         <w:pStyle w:val="BodyText"/>
       </w:pPr>
       <w:r>
-        <w:rPr>
-          <w:b/>
-        </w:rPr>
-        <w:t>Answer:</w:t>
-      </w:r>
-      <w:r>
-        <w:t xml:space="preserve"> Users observe stale state and delayed corrective actions; liveness fails first; economic damage accumulates over time; recovery is manual/runbook-driven.</w:t>
+        <w:t>Users observe stale state and delayed corrective actions; liveness fails first; economic damage accumulates over time; recovery is manual/runbook-driven.</w:t>
       </w:r>
     </w:p>
     <w:p>
@@ -2889,13 +2229,7 @@
         <w:pStyle w:val="BodyText"/>
       </w:pPr>
       <w:r>
-        <w:rPr>
-          <w:b/>
-        </w:rPr>
-        <w:t>Answer:</w:t>
-      </w:r>
-      <w:r>
-        <w:t xml:space="preserve"> Users mostly see operational noise/churn; accounting often survives but costs/MEV drag increase; recovery needs idempotent action sinks and producer cleanup.</w:t>
+        <w:t>Users mostly see operational noise/churn; accounting often survives but costs/MEV drag increase; recovery needs idempotent action sinks and producer cleanup.</w:t>
       </w:r>
     </w:p>
     <w:p>
@@ -2911,13 +2245,7 @@
         <w:pStyle w:val="BodyText"/>
       </w:pPr>
       <w:r>
-        <w:rPr>
-          <w:b/>
-        </w:rPr>
-        <w:t>Answer:</w:t>
-      </w:r>
-      <w:r>
-        <w:t xml:space="preserve"> Users face persistent performance drag; accounting appears reasonable while realized outcomes degrade; costs are borne by LP holders; recovery requires private relay, timing jitter, and harder trigger policy.</w:t>
+        <w:t>Users face persistent performance drag; accounting appears reasonable while realized outcomes degrade; costs are borne by LP holders; recovery requires private relay, timing jitter, and harder trigger policy.</w:t>
       </w:r>
     </w:p>
     <w:sectPr>

</xml_diff>